<commit_message>
Sauvegarde avant mise à jour
</commit_message>
<xml_diff>
--- a/STRUCTURE DU PROJET REACT.docx
+++ b/STRUCTURE DU PROJET REACT.docx
@@ -14,8 +14,10 @@
       <w:r>
         <w:rPr>
           <w:rFonts w:ascii="Times New Roman" w:hAnsi="Times New Roman" w:cs="Times New Roman"/>
-          <w:sz w:val="24"/>
-          <w:szCs w:val="24"/>
+          <w:noProof/>
+          <w:sz w:val="24"/>
+          <w:szCs w:val="24"/>
+          <w:lang w:eastAsia="fr-FR"/>
         </w:rPr>
         <w:drawing>
           <wp:inline distT="0" distB="0" distL="0" distR="0" wp14:anchorId="2A06CE52" wp14:editId="0CC5A262">
@@ -1099,7 +1101,7 @@
           <w:szCs w:val="24"/>
           <w:lang w:eastAsia="fr-FR"/>
         </w:rPr>
-        <w:t>Rôle :</w:t>
+        <w:t xml:space="preserve">Rôle </w:t>
       </w:r>
       <w:r>
         <w:rPr>
@@ -1271,7 +1273,7 @@
           <w:szCs w:val="24"/>
           <w:lang w:eastAsia="fr-FR"/>
         </w:rPr>
-        <w:t xml:space="preserve"> Rôle :</w:t>
+        <w:t xml:space="preserve"> Rôle </w:t>
       </w:r>
       <w:r>
         <w:rPr>
@@ -1457,7 +1459,16 @@
           <w:szCs w:val="24"/>
           <w:lang w:eastAsia="fr-FR"/>
         </w:rPr>
-        <w:t xml:space="preserve"> Rôle :</w:t>
+        <w:t xml:space="preserve"> Rôle</w:t>
+      </w:r>
+      <w:r>
+        <w:rPr>
+          <w:rFonts w:ascii="Times New Roman" w:eastAsia="Times New Roman" w:hAnsi="Times New Roman" w:cs="Times New Roman"/>
+          <w:sz w:val="24"/>
+          <w:szCs w:val="24"/>
+          <w:lang w:eastAsia="fr-FR"/>
+        </w:rPr>
+        <w:t>:</w:t>
       </w:r>
       <w:r>
         <w:rPr>
@@ -3264,7 +3275,18 @@
           <w:szCs w:val="24"/>
           <w:lang w:eastAsia="fr-FR"/>
         </w:rPr>
-        <w:t>Rôle :</w:t>
+        <w:t>Rôle</w:t>
+      </w:r>
+      <w:bookmarkStart w:id="0" w:name="_GoBack"/>
+      <w:bookmarkEnd w:id="0"/>
+      <w:r>
+        <w:rPr>
+          <w:rFonts w:ascii="Times New Roman" w:eastAsia="Times New Roman" w:hAnsi="Times New Roman" w:cs="Times New Roman"/>
+          <w:sz w:val="24"/>
+          <w:szCs w:val="24"/>
+          <w:lang w:eastAsia="fr-FR"/>
+        </w:rPr>
+        <w:t xml:space="preserve"> :</w:t>
       </w:r>
       <w:r>
         <w:rPr>
@@ -4172,8 +4194,6 @@
           <w:szCs w:val="24"/>
         </w:rPr>
       </w:pPr>
-      <w:bookmarkStart w:id="0" w:name="_GoBack"/>
-      <w:bookmarkEnd w:id="0"/>
     </w:p>
     <w:sectPr>
       <w:pgSz w:w="11906" w:h="16838"/>

</xml_diff>